<commit_message>
docs: update authentic Windows screenshots and recompile verified reports
</commit_message>
<xml_diff>
--- a/report/BaoCao_BTL_Nhom11.docx
+++ b/report/BaoCao_BTL_Nhom11.docx
@@ -2742,7 +2742,7 @@
       <w:r>
         <w:drawing>
           <wp:inline xmlns:a="http://schemas.openxmlformats.org/drawingml/2006/main" xmlns:pic="http://schemas.openxmlformats.org/drawingml/2006/picture">
-            <wp:extent cx="5303520" cy="1774269"/>
+            <wp:extent cx="5303520" cy="2814113"/>
             <wp:docPr id="1" name="Picture 1"/>
             <wp:cNvGraphicFramePr>
               <a:graphicFrameLocks noChangeAspect="1"/>
@@ -2763,7 +2763,7 @@
                   <pic:spPr>
                     <a:xfrm>
                       <a:off x="0" y="0"/>
-                      <a:ext cx="5303520" cy="1774269"/>
+                      <a:ext cx="5303520" cy="2814113"/>
                     </a:xfrm>
                     <a:prstGeom prst="rect"/>
                   </pic:spPr>
@@ -4636,7 +4636,7 @@
       <w:r>
         <w:drawing>
           <wp:inline xmlns:a="http://schemas.openxmlformats.org/drawingml/2006/main" xmlns:pic="http://schemas.openxmlformats.org/drawingml/2006/picture">
-            <wp:extent cx="5303520" cy="3027827"/>
+            <wp:extent cx="5303520" cy="2814113"/>
             <wp:docPr id="5" name="Picture 5"/>
             <wp:cNvGraphicFramePr>
               <a:graphicFrameLocks noChangeAspect="1"/>
@@ -4657,7 +4657,7 @@
                   <pic:spPr>
                     <a:xfrm>
                       <a:off x="0" y="0"/>
-                      <a:ext cx="5303520" cy="3027827"/>
+                      <a:ext cx="5303520" cy="2814113"/>
                     </a:xfrm>
                     <a:prstGeom prst="rect"/>
                   </pic:spPr>
@@ -4962,7 +4962,7 @@
       <w:r>
         <w:drawing>
           <wp:inline xmlns:a="http://schemas.openxmlformats.org/drawingml/2006/main" xmlns:pic="http://schemas.openxmlformats.org/drawingml/2006/picture">
-            <wp:extent cx="5303520" cy="4281387"/>
+            <wp:extent cx="5303520" cy="4221169"/>
             <wp:docPr id="7" name="Picture 7"/>
             <wp:cNvGraphicFramePr>
               <a:graphicFrameLocks noChangeAspect="1"/>
@@ -4983,7 +4983,7 @@
                   <pic:spPr>
                     <a:xfrm>
                       <a:off x="0" y="0"/>
-                      <a:ext cx="5303520" cy="4281387"/>
+                      <a:ext cx="5303520" cy="4221169"/>
                     </a:xfrm>
                     <a:prstGeom prst="rect"/>
                   </pic:spPr>
@@ -6452,7 +6452,7 @@
       <w:r>
         <w:drawing>
           <wp:inline xmlns:a="http://schemas.openxmlformats.org/drawingml/2006/main" xmlns:pic="http://schemas.openxmlformats.org/drawingml/2006/picture">
-            <wp:extent cx="5303520" cy="3558345"/>
+            <wp:extent cx="5303520" cy="3671668"/>
             <wp:docPr id="8" name="Picture 8"/>
             <wp:cNvGraphicFramePr>
               <a:graphicFrameLocks noChangeAspect="1"/>
@@ -6473,7 +6473,7 @@
                   <pic:spPr>
                     <a:xfrm>
                       <a:off x="0" y="0"/>
-                      <a:ext cx="5303520" cy="3558345"/>
+                      <a:ext cx="5303520" cy="3671668"/>
                     </a:xfrm>
                     <a:prstGeom prst="rect"/>
                   </pic:spPr>

</xml_diff>

<commit_message>
docs: establish honest photo placeholder frames and purge unverified empty screenshots
</commit_message>
<xml_diff>
--- a/report/BaoCao_BTL_Nhom11.docx
+++ b/report/BaoCao_BTL_Nhom11.docx
@@ -3768,6 +3768,131 @@
         <w:br/>
         <w:t xml:space="preserve">    [!] MÃ LỆNH ĐẶC BIỆT: Gói tin kích hoạt lệnh hủy phiên khẩn cấp (CMD_ABORT_SESSION 0xFF)</w:t>
       </w:r>
+    </w:p>
+    <w:p>
+      <w:pPr>
+        <w:spacing w:line="360" w:lineRule="auto" w:after="120"/>
+        <w:jc w:val="both"/>
+      </w:pPr>
+      <w:r>
+        <w:rPr>
+          <w:rFonts w:ascii="Times New Roman" w:hAnsi="Times New Roman"/>
+          <w:b w:val="0"/>
+          <w:i w:val="0"/>
+          <w:sz w:val="26"/>
+        </w:rPr>
+        <w:t xml:space="preserve">Dưới đây là vị trí dành cho hình ảnh chụp màn hình thực tế từ phần mềm Wireshark khi mở tệp gói tin mạng </w:t>
+      </w:r>
+      <w:r>
+        <w:rPr>
+          <w:rFonts w:ascii="Consolas" w:hAnsi="Consolas"/>
+          <w:b/>
+          <w:color w:val="A02020"/>
+          <w:sz w:val="23"/>
+        </w:rPr>
+        <w:t>network_capture/iot_sensor_stream.pcap</w:t>
+      </w:r>
+      <w:r>
+        <w:rPr>
+          <w:rFonts w:ascii="Times New Roman" w:hAnsi="Times New Roman"/>
+          <w:b w:val="0"/>
+          <w:i w:val="0"/>
+          <w:sz w:val="26"/>
+        </w:rPr>
+        <w:t xml:space="preserve">, thể hiện trực quan các khung truyền UDP chứa Magic Header </w:t>
+      </w:r>
+      <w:r>
+        <w:rPr>
+          <w:rFonts w:ascii="Consolas" w:hAnsi="Consolas"/>
+          <w:b/>
+          <w:color w:val="A02020"/>
+          <w:sz w:val="23"/>
+        </w:rPr>
+        <w:t>FZP1</w:t>
+      </w:r>
+      <w:r>
+        <w:rPr>
+          <w:rFonts w:ascii="Times New Roman" w:hAnsi="Times New Roman"/>
+          <w:b w:val="0"/>
+          <w:i w:val="0"/>
+          <w:sz w:val="26"/>
+        </w:rPr>
+        <w:t xml:space="preserve"> (0x46, 0x5A, 0x50, 0x31) và trường kiểm tra tính toàn vẹn Checksum:</w:t>
+      </w:r>
+    </w:p>
+    <w:tbl>
+      <w:tblPr>
+        <w:tblW w:type="auto" w:w="0"/>
+        <w:jc w:val="center"/>
+        <w:tblLook w:firstColumn="1" w:firstRow="1" w:lastColumn="0" w:lastRow="0" w:noHBand="0" w:noVBand="1" w:val="04A0"/>
+        <w:tblBorders>
+          <w:top w:val="single" w:sz="6" w:space="0" w:color="E0A96D"/>
+          <w:bottom w:val="single" w:sz="6" w:space="0" w:color="E0A96D"/>
+          <w:left w:val="none"/>
+          <w:right w:val="none"/>
+          <w:insideH w:val="single" w:sz="6" w:space="0" w:color="E0A96D"/>
+          <w:insideV w:val="none"/>
+        </w:tblBorders>
+      </w:tblPr>
+      <w:tblGrid>
+        <w:gridCol w:w="9355"/>
+      </w:tblGrid>
+      <w:tr>
+        <w:tc>
+          <w:tcPr>
+            <w:tcW w:type="dxa" w:w="9355"/>
+            <w:shd w:fill="FFFDF5"/>
+            <w:tcMar>
+              <w:top w:w="140" w:type="dxa"/>
+              <w:bottom w:w="140" w:type="dxa"/>
+              <w:left w:w="180" w:type="dxa"/>
+              <w:right w:w="180" w:type="dxa"/>
+            </w:tcMar>
+          </w:tcPr>
+          <w:p>
+            <w:pPr>
+              <w:spacing w:before="80" w:after="80" w:line="300" w:lineRule="auto"/>
+              <w:jc w:val="center"/>
+            </w:pPr>
+            <w:r>
+              <w:rPr>
+                <w:rFonts w:ascii="Times New Roman" w:hAnsi="Times New Roman"/>
+                <w:b/>
+                <w:color w:val="B45000"/>
+                <w:sz w:val="22"/>
+              </w:rPr>
+              <w:t>📷 [KHUNG CHỜ CHÈN ẢNH MINH CHỨNG THỰC TẾ]</w:t>
+              <w:br/>
+            </w:r>
+            <w:r>
+              <w:rPr>
+                <w:rFonts w:ascii="Times New Roman" w:hAnsi="Times New Roman"/>
+                <w:b/>
+                <w:color w:val="44546A"/>
+                <w:sz w:val="21"/>
+              </w:rPr>
+              <w:t>Nội dung minh chứng: Giao diện phần mềm Wireshark phân tích gói tin mạng FZP1 thực tế từ tệp iot_sensor_stream.pcap</w:t>
+              <w:br/>
+            </w:r>
+            <w:r>
+              <w:rPr>
+                <w:rFonts w:ascii="Times New Roman" w:hAnsi="Times New Roman"/>
+                <w:i/>
+                <w:color w:val="595959"/>
+                <w:sz w:val="19"/>
+              </w:rPr>
+              <w:t>Đường dẫn tệp cần bổ sung: report/screenshots/wireshark_pcap_trace.png</w:t>
+              <w:br/>
+              <w:t>(Ghi chú: Sinh viên tự thực hiện thao tác và chụp màn hình thực tế trên máy tính, lưu ảnh định dạng PNG vào đường dẫn trên. Hệ thống biên soạn sẽ tự động nhận diện và chèn ảnh thật vào vị trí này).</w:t>
+            </w:r>
+          </w:p>
+        </w:tc>
+      </w:tr>
+    </w:tbl>
+    <w:p>
+      <w:pPr>
+        <w:spacing w:after="120"/>
+      </w:pPr>
     </w:p>
     <w:p>
       <w:pPr>
@@ -16843,6 +16968,146 @@
     </w:p>
     <w:p>
       <w:pPr>
+        <w:pStyle w:val="ListBullet"/>
+        <w:spacing w:after="80" w:line="360" w:lineRule="auto"/>
+        <w:jc w:val="both"/>
+      </w:pPr>
+      <w:r>
+        <w:rPr>
+          <w:rFonts w:ascii="Times New Roman" w:hAnsi="Times New Roman"/>
+          <w:b/>
+          <w:sz w:val="26"/>
+        </w:rPr>
+        <w:t>Minh chứng Thực thi Terminal Kiểm định:</w:t>
+      </w:r>
+    </w:p>
+    <w:p>
+      <w:pPr>
+        <w:spacing w:line="360" w:lineRule="auto" w:after="120"/>
+        <w:jc w:val="both"/>
+      </w:pPr>
+      <w:r>
+        <w:rPr>
+          <w:rFonts w:ascii="Times New Roman" w:hAnsi="Times New Roman"/>
+          <w:b w:val="0"/>
+          <w:i w:val="0"/>
+          <w:sz w:val="26"/>
+        </w:rPr>
+        <w:t xml:space="preserve">Dưới đây là vị trí dành cho hình ảnh chụp màn hình cửa sổ Windows PowerShell trên máy thực tế khi chạy thành công bộ thẩm định tự động toàn diện 8 khâu </w:t>
+      </w:r>
+      <w:r>
+        <w:rPr>
+          <w:rFonts w:ascii="Consolas" w:hAnsi="Consolas"/>
+          <w:b/>
+          <w:color w:val="A02020"/>
+          <w:sz w:val="23"/>
+        </w:rPr>
+        <w:t>scripts/verify_project.py</w:t>
+      </w:r>
+      <w:r>
+        <w:rPr>
+          <w:rFonts w:ascii="Times New Roman" w:hAnsi="Times New Roman"/>
+          <w:b w:val="0"/>
+          <w:i w:val="0"/>
+          <w:sz w:val="26"/>
+        </w:rPr>
+        <w:t xml:space="preserve"> và bộ kiểm thử tự động 14 test cases </w:t>
+      </w:r>
+      <w:r>
+        <w:rPr>
+          <w:rFonts w:ascii="Consolas" w:hAnsi="Consolas"/>
+          <w:b/>
+          <w:color w:val="A02020"/>
+          <w:sz w:val="23"/>
+        </w:rPr>
+        <w:t>pytest tests/ -v</w:t>
+      </w:r>
+      <w:r>
+        <w:rPr>
+          <w:rFonts w:ascii="Times New Roman" w:hAnsi="Times New Roman"/>
+          <w:b w:val="0"/>
+          <w:i w:val="0"/>
+          <w:sz w:val="26"/>
+        </w:rPr>
+        <w:t>:</w:t>
+      </w:r>
+    </w:p>
+    <w:tbl>
+      <w:tblPr>
+        <w:tblW w:type="auto" w:w="0"/>
+        <w:jc w:val="center"/>
+        <w:tblLook w:firstColumn="1" w:firstRow="1" w:lastColumn="0" w:lastRow="0" w:noHBand="0" w:noVBand="1" w:val="04A0"/>
+        <w:tblBorders>
+          <w:top w:val="single" w:sz="6" w:space="0" w:color="E0A96D"/>
+          <w:bottom w:val="single" w:sz="6" w:space="0" w:color="E0A96D"/>
+          <w:left w:val="none"/>
+          <w:right w:val="none"/>
+          <w:insideH w:val="single" w:sz="6" w:space="0" w:color="E0A96D"/>
+          <w:insideV w:val="none"/>
+        </w:tblBorders>
+      </w:tblPr>
+      <w:tblGrid>
+        <w:gridCol w:w="9355"/>
+      </w:tblGrid>
+      <w:tr>
+        <w:tc>
+          <w:tcPr>
+            <w:tcW w:type="dxa" w:w="9355"/>
+            <w:shd w:fill="FFFDF5"/>
+            <w:tcMar>
+              <w:top w:w="140" w:type="dxa"/>
+              <w:bottom w:w="140" w:type="dxa"/>
+              <w:left w:w="180" w:type="dxa"/>
+              <w:right w:w="180" w:type="dxa"/>
+            </w:tcMar>
+          </w:tcPr>
+          <w:p>
+            <w:pPr>
+              <w:spacing w:before="80" w:after="80" w:line="300" w:lineRule="auto"/>
+              <w:jc w:val="center"/>
+            </w:pPr>
+            <w:r>
+              <w:rPr>
+                <w:rFonts w:ascii="Times New Roman" w:hAnsi="Times New Roman"/>
+                <w:b/>
+                <w:color w:val="B45000"/>
+                <w:sz w:val="22"/>
+              </w:rPr>
+              <w:t>📷 [KHUNG CHỜ CHÈN ẢNH MINH CHỨNG THỰC TẾ]</w:t>
+              <w:br/>
+            </w:r>
+            <w:r>
+              <w:rPr>
+                <w:rFonts w:ascii="Times New Roman" w:hAnsi="Times New Roman"/>
+                <w:b/>
+                <w:color w:val="44546A"/>
+                <w:sz w:val="21"/>
+              </w:rPr>
+              <w:t>Nội dung minh chứng: Giao diện Terminal Windows PowerShell thực tế chạy thành công bộ thẩm định tự động 8 khâu verify_project.py và PyTest</w:t>
+              <w:br/>
+            </w:r>
+            <w:r>
+              <w:rPr>
+                <w:rFonts w:ascii="Times New Roman" w:hAnsi="Times New Roman"/>
+                <w:i/>
+                <w:color w:val="595959"/>
+                <w:sz w:val="19"/>
+              </w:rPr>
+              <w:t>Đường dẫn tệp cần bổ sung: report/screenshots/terminal_verify_8_stages.png</w:t>
+              <w:br/>
+              <w:t>(Ghi chú: Sinh viên tự thực hiện thao tác và chụp màn hình thực tế trên máy tính, lưu ảnh định dạng PNG vào đường dẫn trên. Hệ thống biên soạn sẽ tự động nhận diện và chèn ảnh thật vào vị trí này).</w:t>
+            </w:r>
+          </w:p>
+        </w:tc>
+      </w:tr>
+    </w:tbl>
+    <w:p>
+      <w:pPr>
+        <w:spacing w:after="120"/>
+      </w:pPr>
+    </w:p>
+    <w:p>
+      <w:pPr>
         <w:keepNext/>
         <w:spacing w:before="200" w:after="60"/>
       </w:pPr>
@@ -17228,7 +17493,7 @@
           <w:i w:val="0"/>
           <w:sz w:val="26"/>
         </w:rPr>
-        <w:t xml:space="preserve">Dưới đây là hình ảnh chụp trực tiếp từ cửa sổ giao diện khi chạy các tệp thực thi gốc </w:t>
+        <w:t xml:space="preserve">Dưới đây là vị trí dành cho hình ảnh chụp màn hình trực tiếp từ cửa sổ giao diện công cụ </w:t>
       </w:r>
       <w:r>
         <w:rPr>
@@ -17237,16 +17502,16 @@
           <w:color w:val="A02020"/>
           <w:sz w:val="23"/>
         </w:rPr>
-        <w:t>SpecVerificationLab.exe</w:t>
-      </w:r>
-      <w:r>
-        <w:rPr>
-          <w:rFonts w:ascii="Times New Roman" w:hAnsi="Times New Roman"/>
-          <w:b w:val="0"/>
-          <w:i w:val="0"/>
-          <w:sz w:val="26"/>
-        </w:rPr>
-        <w:t xml:space="preserve"> và </w:t>
+        <w:t>SecLabFramework.exe</w:t>
+      </w:r>
+      <w:r>
+        <w:rPr>
+          <w:rFonts w:ascii="Times New Roman" w:hAnsi="Times New Roman"/>
+          <w:b w:val="0"/>
+          <w:i w:val="0"/>
+          <w:sz w:val="26"/>
+        </w:rPr>
+        <w:t xml:space="preserve"> (Tab Ch6) hoặc </w:t>
       </w:r>
       <w:r>
         <w:rPr>
@@ -17255,127 +17520,109 @@
           <w:color w:val="A02020"/>
           <w:sz w:val="23"/>
         </w:rPr>
-        <w:t>SecLabFramework.exe</w:t>
-      </w:r>
-      <w:r>
-        <w:rPr>
-          <w:rFonts w:ascii="Times New Roman" w:hAnsi="Times New Roman"/>
-          <w:b w:val="0"/>
-          <w:i w:val="0"/>
-          <w:sz w:val="26"/>
-        </w:rPr>
-        <w:t>:</w:t>
+        <w:t>SpecVerificationLab.exe</w:t>
+      </w:r>
+      <w:r>
+        <w:rPr>
+          <w:rFonts w:ascii="Times New Roman" w:hAnsi="Times New Roman"/>
+          <w:b w:val="0"/>
+          <w:i w:val="0"/>
+          <w:sz w:val="26"/>
+        </w:rPr>
+        <w:t xml:space="preserve"> sau khi nạp tệp đặc tả </w:t>
+      </w:r>
+      <w:r>
+        <w:rPr>
+          <w:rFonts w:ascii="Consolas" w:hAnsi="Consolas"/>
+          <w:b/>
+          <w:color w:val="A02020"/>
+          <w:sz w:val="23"/>
+        </w:rPr>
+        <w:t>specification/Nhom11_FZP1_Fuzzing_Spec.xlsx</w:t>
+      </w:r>
+      <w:r>
+        <w:rPr>
+          <w:rFonts w:ascii="Times New Roman" w:hAnsi="Times New Roman"/>
+          <w:b w:val="0"/>
+          <w:i w:val="0"/>
+          <w:sz w:val="26"/>
+        </w:rPr>
+        <w:t xml:space="preserve"> và thực hiện đầy đủ quy trình kiểm chứng Pipeline (hiển thị danh sách REQ-1..9, mã nguồn C sinh ra và đồ thị kiểm chứng Kripke):</w:t>
       </w:r>
     </w:p>
+    <w:tbl>
+      <w:tblPr>
+        <w:tblW w:type="auto" w:w="0"/>
+        <w:jc w:val="center"/>
+        <w:tblLook w:firstColumn="1" w:firstRow="1" w:lastColumn="0" w:lastRow="0" w:noHBand="0" w:noVBand="1" w:val="04A0"/>
+        <w:tblBorders>
+          <w:top w:val="single" w:sz="6" w:space="0" w:color="E0A96D"/>
+          <w:bottom w:val="single" w:sz="6" w:space="0" w:color="E0A96D"/>
+          <w:left w:val="none"/>
+          <w:right w:val="none"/>
+          <w:insideH w:val="single" w:sz="6" w:space="0" w:color="E0A96D"/>
+          <w:insideV w:val="none"/>
+        </w:tblBorders>
+      </w:tblPr>
+      <w:tblGrid>
+        <w:gridCol w:w="9355"/>
+      </w:tblGrid>
+      <w:tr>
+        <w:tc>
+          <w:tcPr>
+            <w:tcW w:type="dxa" w:w="9355"/>
+            <w:shd w:fill="FFFDF5"/>
+            <w:tcMar>
+              <w:top w:w="140" w:type="dxa"/>
+              <w:bottom w:w="140" w:type="dxa"/>
+              <w:left w:w="180" w:type="dxa"/>
+              <w:right w:w="180" w:type="dxa"/>
+            </w:tcMar>
+          </w:tcPr>
+          <w:p>
+            <w:pPr>
+              <w:spacing w:before="80" w:after="80" w:line="300" w:lineRule="auto"/>
+              <w:jc w:val="center"/>
+            </w:pPr>
+            <w:r>
+              <w:rPr>
+                <w:rFonts w:ascii="Times New Roman" w:hAnsi="Times New Roman"/>
+                <w:b/>
+                <w:color w:val="B45000"/>
+                <w:sz w:val="22"/>
+              </w:rPr>
+              <w:t>📷 [KHUNG CHỜ CHÈN ẢNH MINH CHỨNG THỰC TẾ]</w:t>
+              <w:br/>
+            </w:r>
+            <w:r>
+              <w:rPr>
+                <w:rFonts w:ascii="Times New Roman" w:hAnsi="Times New Roman"/>
+                <w:b/>
+                <w:color w:val="44546A"/>
+                <w:sz w:val="21"/>
+              </w:rPr>
+              <w:t>Nội dung minh chứng: Giao diện thực tế công cụ SecLabFramework (Tab Ch6) khi nạp đặc tả Nhom11_FZP1_Fuzzing_Spec.xlsx và chạy Pipeline kiểm chứng</w:t>
+              <w:br/>
+            </w:r>
+            <w:r>
+              <w:rPr>
+                <w:rFonts w:ascii="Times New Roman" w:hAnsi="Times New Roman"/>
+                <w:i/>
+                <w:color w:val="595959"/>
+                <w:sz w:val="19"/>
+              </w:rPr>
+              <w:t>Đường dẫn tệp cần bổ sung: report/screenshots/seclab_real_pipeline_verified.png</w:t>
+              <w:br/>
+              <w:t>(Ghi chú: Sinh viên tự thực hiện thao tác và chụp màn hình thực tế trên máy tính, lưu ảnh định dạng PNG vào đường dẫn trên. Hệ thống biên soạn sẽ tự động nhận diện và chèn ảnh thật vào vị trí này).</w:t>
+            </w:r>
+          </w:p>
+        </w:tc>
+      </w:tr>
+    </w:tbl>
     <w:p>
       <w:pPr>
-        <w:spacing w:before="200" w:after="60"/>
-        <w:jc w:val="center"/>
-      </w:pPr>
-      <w:r>
-        <w:drawing>
-          <wp:inline xmlns:a="http://schemas.openxmlformats.org/drawingml/2006/main" xmlns:pic="http://schemas.openxmlformats.org/drawingml/2006/picture">
-            <wp:extent cx="5303520" cy="3588746"/>
-            <wp:docPr id="6" name="Picture 6"/>
-            <wp:cNvGraphicFramePr>
-              <a:graphicFrameLocks noChangeAspect="1"/>
-            </wp:cNvGraphicFramePr>
-            <a:graphic>
-              <a:graphicData uri="http://schemas.openxmlformats.org/drawingml/2006/picture">
-                <pic:pic>
-                  <pic:nvPicPr>
-                    <pic:cNvPr id="0" name="spec_verification_lab_authentic.png"/>
-                    <pic:cNvPicPr/>
-                  </pic:nvPicPr>
-                  <pic:blipFill>
-                    <a:blip r:embed="rId16"/>
-                    <a:stretch>
-                      <a:fillRect/>
-                    </a:stretch>
-                  </pic:blipFill>
-                  <pic:spPr>
-                    <a:xfrm>
-                      <a:off x="0" y="0"/>
-                      <a:ext cx="5303520" cy="3588746"/>
-                    </a:xfrm>
-                    <a:prstGeom prst="rect"/>
-                  </pic:spPr>
-                </pic:pic>
-              </a:graphicData>
-            </a:graphic>
-          </wp:inline>
-        </w:drawing>
-      </w:r>
-    </w:p>
-    <w:p>
-      <w:pPr>
-        <w:spacing w:after="200"/>
-        <w:jc w:val="center"/>
-      </w:pPr>
-      <w:r>
-        <w:rPr>
-          <w:rFonts w:ascii="Times New Roman" w:hAnsi="Times New Roman"/>
-          <w:i/>
-          <w:color w:val="44546A"/>
-          <w:sz w:val="20"/>
-        </w:rPr>
-        <w:t>Hình: Giao diện thực tế công cụ SpecVerificationLab.exe khi nạp và kiểm chứng đặc tả FZP1</w:t>
-      </w:r>
-    </w:p>
-    <w:p>
-      <w:pPr>
-        <w:spacing w:before="200" w:after="60"/>
-        <w:jc w:val="center"/>
-      </w:pPr>
-      <w:r>
-        <w:drawing>
-          <wp:inline xmlns:a="http://schemas.openxmlformats.org/drawingml/2006/main" xmlns:pic="http://schemas.openxmlformats.org/drawingml/2006/picture">
-            <wp:extent cx="5303520" cy="3588746"/>
-            <wp:docPr id="7" name="Picture 7"/>
-            <wp:cNvGraphicFramePr>
-              <a:graphicFrameLocks noChangeAspect="1"/>
-            </wp:cNvGraphicFramePr>
-            <a:graphic>
-              <a:graphicData uri="http://schemas.openxmlformats.org/drawingml/2006/picture">
-                <pic:pic>
-                  <pic:nvPicPr>
-                    <pic:cNvPr id="0" name="seclab_real_capture.png"/>
-                    <pic:cNvPicPr/>
-                  </pic:nvPicPr>
-                  <pic:blipFill>
-                    <a:blip r:embed="rId17"/>
-                    <a:stretch>
-                      <a:fillRect/>
-                    </a:stretch>
-                  </pic:blipFill>
-                  <pic:spPr>
-                    <a:xfrm>
-                      <a:off x="0" y="0"/>
-                      <a:ext cx="5303520" cy="3588746"/>
-                    </a:xfrm>
-                    <a:prstGeom prst="rect"/>
-                  </pic:spPr>
-                </pic:pic>
-              </a:graphicData>
-            </a:graphic>
-          </wp:inline>
-        </w:drawing>
-      </w:r>
-    </w:p>
-    <w:p>
-      <w:pPr>
-        <w:spacing w:after="200"/>
-        <w:jc w:val="center"/>
-      </w:pPr>
-      <w:r>
-        <w:rPr>
-          <w:rFonts w:ascii="Times New Roman" w:hAnsi="Times New Roman"/>
-          <w:i/>
-          <w:color w:val="44546A"/>
-          <w:sz w:val="20"/>
-        </w:rPr>
-        <w:t>Hình: Giao diện thực tế công cụ SecLabFramework.exe (Tab Ch6) khi kiểm chứng đặc tả FZP1</w:t>
-      </w:r>
+        <w:spacing w:after="120"/>
+      </w:pPr>
     </w:p>
     <w:p>
       <w:pPr>
@@ -19737,7 +19984,7 @@
         <w:drawing>
           <wp:inline xmlns:a="http://schemas.openxmlformats.org/drawingml/2006/main" xmlns:pic="http://schemas.openxmlformats.org/drawingml/2006/picture">
             <wp:extent cx="5303520" cy="3241040"/>
-            <wp:docPr id="8" name="Picture 8"/>
+            <wp:docPr id="6" name="Picture 6"/>
             <wp:cNvGraphicFramePr>
               <a:graphicFrameLocks noChangeAspect="1"/>
             </wp:cNvGraphicFramePr>
@@ -19749,7 +19996,7 @@
                     <pic:cNvPicPr/>
                   </pic:nvPicPr>
                   <pic:blipFill>
-                    <a:blip r:embed="rId18"/>
+                    <a:blip r:embed="rId16"/>
                     <a:stretch>
                       <a:fillRect/>
                     </a:stretch>

</xml_diff>